<commit_message>
Deploying to gh-pages from @ Morrison-Lab/rme@c2c3eb1c74c9d7e7f91d05e32ada3529dfb810b7 🚀
</commit_message>
<xml_diff>
--- a/chapters/generalized-additive-models-handout.docx
+++ b/chapters/generalized-additive-models-handout.docx
@@ -39783,7 +39783,7 @@
         <w:rPr>
           <w:rStyle w:val="CommentTok"/>
         </w:rPr>
-        <w:t xml:space="preserve">#&gt; 1.00 1.01  total = 4.01 </w:t>
+        <w:t xml:space="preserve">#&gt; 1.02 1.03  total = 4.05 </w:t>
       </w:r>
       <w:r>
         <w:br/>
@@ -41522,7 +41522,7 @@
         <w:rPr>
           <w:rStyle w:val="VerbatimChar"/>
         </w:rPr>
-        <w:t xml:space="preserve">#&gt; Gradient range [-0.000358419,-2.1343e-05]</w:t>
+        <w:t xml:space="preserve">#&gt; Gradient range [-0.000404069,-1.352e-05]</w:t>
       </w:r>
       <w:r>
         <w:br/>
@@ -41540,7 +41540,7 @@
         <w:rPr>
           <w:rStyle w:val="VerbatimChar"/>
         </w:rPr>
-        <w:t xml:space="preserve">#&gt; Hessian positive definite, eigenvalue range [3.16164e-05,0.220195].</w:t>
+        <w:t xml:space="preserve">#&gt; Hessian positive definite, eigenvalue range [1.35192e-05,0.220195].</w:t>
       </w:r>
       <w:r>
         <w:br/>
@@ -42487,7 +42487,7 @@
         <w:rPr>
           <w:rStyle w:val="CommentTok"/>
         </w:rPr>
-        <w:t xml:space="preserve">#&gt;              Estimate Std. Error   z value     Pr(&gt;|z|)</w:t>
+        <w:t xml:space="preserve">#&gt;               Estimate Std. Error   z value     Pr(&gt;|z|)</w:t>
       </w:r>
       <w:r>
         <w:br/>
@@ -42496,7 +42496,7 @@
         <w:rPr>
           <w:rStyle w:val="CommentTok"/>
         </w:rPr>
-        <w:t xml:space="preserve">#&gt; (Intercept)  -2.97147   0.117513 -25.28619 4.53227e-141</w:t>
+        <w:t xml:space="preserve">#&gt; (Intercept)  -2.971461   0.117513 -25.28618 4.53331e-141</w:t>
       </w:r>
       <w:r>
         <w:br/>
@@ -42505,7 +42505,7 @@
         <w:rPr>
           <w:rStyle w:val="CommentTok"/>
         </w:rPr>
-        <w:t xml:space="preserve">#&gt; dibpatType A  0.78173   0.141714   5.51627  3.46277e-08</w:t>
+        <w:t xml:space="preserve">#&gt; dibpatType A  0.781729   0.141714   5.51626  3.46292e-08</w:t>
       </w:r>
     </w:p>
     <w:p>
@@ -42561,7 +42561,7 @@
         <w:rPr>
           <w:rStyle w:val="CommentTok"/>
         </w:rPr>
-        <w:t xml:space="preserve">#&gt;            edf  Ref.df  Chi.sq   p-value</w:t>
+        <w:t xml:space="preserve">#&gt;            edf  Ref.df  Chi.sq    p-value</w:t>
       </w:r>
       <w:r>
         <w:br/>
@@ -42570,7 +42570,7 @@
         <w:rPr>
           <w:rStyle w:val="CommentTok"/>
         </w:rPr>
-        <w:t xml:space="preserve">#&gt; s(age) 1.00107 1.00214 36.4005 0.0000000</w:t>
+        <w:t xml:space="preserve">#&gt; s(age) 1.00156 1.00312 36.3980 0.00000000</w:t>
       </w:r>
       <w:r>
         <w:br/>
@@ -42579,7 +42579,7 @@
         <w:rPr>
           <w:rStyle w:val="CommentTok"/>
         </w:rPr>
-        <w:t xml:space="preserve">#&gt; s(bmi) 1.29959 1.54968 10.8386 0.0064354</w:t>
+        <w:t xml:space="preserve">#&gt; s(bmi) 1.29791 1.54685 10.8353 0.00641275</w:t>
       </w:r>
     </w:p>
     <w:p>
@@ -44909,7 +44909,7 @@
         <w:rPr>
           <w:rStyle w:val="CommentTok"/>
         </w:rPr>
-        <w:t xml:space="preserve">#&gt; s(age)  1.00   1.00  26.55 1.1e-06 ***</w:t>
+        <w:t xml:space="preserve">#&gt; s(age)  1.00   1.00  26.55 5.8e-07 ***</w:t>
       </w:r>
       <w:r>
         <w:br/>
@@ -44936,7 +44936,7 @@
         <w:rPr>
           <w:rStyle w:val="CommentTok"/>
         </w:rPr>
-        <w:t xml:space="preserve">#&gt; s(sbp)  1.00   1.00  22.83 1.4e-06 ***</w:t>
+        <w:t xml:space="preserve">#&gt; s(sbp)  1.00   1.00  22.83 1.7e-06 ***</w:t>
       </w:r>
       <w:r>
         <w:br/>

</xml_diff>

<commit_message>
Deploying to gh-pages from @ Morrison-Lab/rme@1f42b5350c2ab547189a326bef98358ba13c2dcc 🚀
</commit_message>
<xml_diff>
--- a/chapters/generalized-additive-models-handout.docx
+++ b/chapters/generalized-additive-models-handout.docx
@@ -40243,7 +40243,7 @@
         <w:rPr>
           <w:rStyle w:val="CommentTok"/>
         </w:rPr>
-        <w:t xml:space="preserve">#&gt; 1.02 1.03  total = 4.05 </w:t>
+        <w:t xml:space="preserve">#&gt; 1.00 1.01  total = 4.01 </w:t>
       </w:r>
       <w:r>
         <w:br/>
@@ -41982,7 +41982,7 @@
         <w:rPr>
           <w:rStyle w:val="VerbatimChar"/>
         </w:rPr>
-        <w:t xml:space="preserve">#&gt; Gradient range [-0.000404069,-1.352e-05]</w:t>
+        <w:t xml:space="preserve">#&gt; Gradient range [-0.000358419,-2.1343e-05]</w:t>
       </w:r>
       <w:r>
         <w:br/>
@@ -42000,7 +42000,7 @@
         <w:rPr>
           <w:rStyle w:val="VerbatimChar"/>
         </w:rPr>
-        <w:t xml:space="preserve">#&gt; Hessian positive definite, eigenvalue range [1.35192e-05,0.220195].</w:t>
+        <w:t xml:space="preserve">#&gt; Hessian positive definite, eigenvalue range [3.16164e-05,0.220195].</w:t>
       </w:r>
       <w:r>
         <w:br/>
@@ -42947,7 +42947,7 @@
         <w:rPr>
           <w:rStyle w:val="CommentTok"/>
         </w:rPr>
-        <w:t xml:space="preserve">#&gt;               Estimate Std. Error   z value     Pr(&gt;|z|)</w:t>
+        <w:t xml:space="preserve">#&gt;              Estimate Std. Error   z value     Pr(&gt;|z|)</w:t>
       </w:r>
       <w:r>
         <w:br/>
@@ -42956,7 +42956,7 @@
         <w:rPr>
           <w:rStyle w:val="CommentTok"/>
         </w:rPr>
-        <w:t xml:space="preserve">#&gt; (Intercept)  -2.971461   0.117513 -25.28618 4.53331e-141</w:t>
+        <w:t xml:space="preserve">#&gt; (Intercept)  -2.97147   0.117513 -25.28619 4.53227e-141</w:t>
       </w:r>
       <w:r>
         <w:br/>
@@ -42965,7 +42965,7 @@
         <w:rPr>
           <w:rStyle w:val="CommentTok"/>
         </w:rPr>
-        <w:t xml:space="preserve">#&gt; dibpatType A  0.781729   0.141714   5.51626  3.46292e-08</w:t>
+        <w:t xml:space="preserve">#&gt; dibpatType A  0.78173   0.141714   5.51627  3.46277e-08</w:t>
       </w:r>
     </w:p>
     <w:p>
@@ -43021,7 +43021,7 @@
         <w:rPr>
           <w:rStyle w:val="CommentTok"/>
         </w:rPr>
-        <w:t xml:space="preserve">#&gt;            edf  Ref.df  Chi.sq    p-value</w:t>
+        <w:t xml:space="preserve">#&gt;            edf  Ref.df  Chi.sq   p-value</w:t>
       </w:r>
       <w:r>
         <w:br/>
@@ -43030,7 +43030,7 @@
         <w:rPr>
           <w:rStyle w:val="CommentTok"/>
         </w:rPr>
-        <w:t xml:space="preserve">#&gt; s(age) 1.00156 1.00312 36.3980 0.00000000</w:t>
+        <w:t xml:space="preserve">#&gt; s(age) 1.00107 1.00214 36.4005 0.0000000</w:t>
       </w:r>
       <w:r>
         <w:br/>
@@ -43039,7 +43039,7 @@
         <w:rPr>
           <w:rStyle w:val="CommentTok"/>
         </w:rPr>
-        <w:t xml:space="preserve">#&gt; s(bmi) 1.29791 1.54685 10.8353 0.00641275</w:t>
+        <w:t xml:space="preserve">#&gt; s(bmi) 1.29959 1.54968 10.8386 0.0064354</w:t>
       </w:r>
     </w:p>
     <w:p>
@@ -45369,7 +45369,7 @@
         <w:rPr>
           <w:rStyle w:val="CommentTok"/>
         </w:rPr>
-        <w:t xml:space="preserve">#&gt; s(age)  1.00   1.00  26.55 5.8e-07 ***</w:t>
+        <w:t xml:space="preserve">#&gt; s(age)  1.00   1.00  26.55 1.1e-06 ***</w:t>
       </w:r>
       <w:r>
         <w:br/>
@@ -45396,7 +45396,7 @@
         <w:rPr>
           <w:rStyle w:val="CommentTok"/>
         </w:rPr>
-        <w:t xml:space="preserve">#&gt; s(sbp)  1.00   1.00  22.83 1.7e-06 ***</w:t>
+        <w:t xml:space="preserve">#&gt; s(sbp)  1.00   1.00  22.83 1.4e-06 ***</w:t>
       </w:r>
       <w:r>
         <w:br/>

</xml_diff>

<commit_message>
Deploying to gh-pages from @ Morrison-Lab/rme@1edbbef40242e64bb79803561976a29938ea65b4 🚀
</commit_message>
<xml_diff>
--- a/chapters/generalized-additive-models-handout.docx
+++ b/chapters/generalized-additive-models-handout.docx
@@ -40243,7 +40243,7 @@
         <w:rPr>
           <w:rStyle w:val="CommentTok"/>
         </w:rPr>
-        <w:t xml:space="preserve">#&gt; 1.00 1.01  total = 4.01 </w:t>
+        <w:t xml:space="preserve">#&gt; 1.02 1.03  total = 4.05 </w:t>
       </w:r>
       <w:r>
         <w:br/>
@@ -41982,7 +41982,7 @@
         <w:rPr>
           <w:rStyle w:val="VerbatimChar"/>
         </w:rPr>
-        <w:t xml:space="preserve">#&gt; Gradient range [-0.000358419,-2.1343e-05]</w:t>
+        <w:t xml:space="preserve">#&gt; Gradient range [-0.000404069,-1.352e-05]</w:t>
       </w:r>
       <w:r>
         <w:br/>
@@ -42000,7 +42000,7 @@
         <w:rPr>
           <w:rStyle w:val="VerbatimChar"/>
         </w:rPr>
-        <w:t xml:space="preserve">#&gt; Hessian positive definite, eigenvalue range [3.16164e-05,0.220195].</w:t>
+        <w:t xml:space="preserve">#&gt; Hessian positive definite, eigenvalue range [1.35192e-05,0.220195].</w:t>
       </w:r>
       <w:r>
         <w:br/>
@@ -42947,7 +42947,7 @@
         <w:rPr>
           <w:rStyle w:val="CommentTok"/>
         </w:rPr>
-        <w:t xml:space="preserve">#&gt;              Estimate Std. Error   z value     Pr(&gt;|z|)</w:t>
+        <w:t xml:space="preserve">#&gt;               Estimate Std. Error   z value     Pr(&gt;|z|)</w:t>
       </w:r>
       <w:r>
         <w:br/>
@@ -42956,7 +42956,7 @@
         <w:rPr>
           <w:rStyle w:val="CommentTok"/>
         </w:rPr>
-        <w:t xml:space="preserve">#&gt; (Intercept)  -2.97147   0.117513 -25.28619 4.53227e-141</w:t>
+        <w:t xml:space="preserve">#&gt; (Intercept)  -2.971461   0.117513 -25.28618 4.53331e-141</w:t>
       </w:r>
       <w:r>
         <w:br/>
@@ -42965,7 +42965,7 @@
         <w:rPr>
           <w:rStyle w:val="CommentTok"/>
         </w:rPr>
-        <w:t xml:space="preserve">#&gt; dibpatType A  0.78173   0.141714   5.51627  3.46277e-08</w:t>
+        <w:t xml:space="preserve">#&gt; dibpatType A  0.781729   0.141714   5.51626  3.46292e-08</w:t>
       </w:r>
     </w:p>
     <w:p>
@@ -43021,7 +43021,7 @@
         <w:rPr>
           <w:rStyle w:val="CommentTok"/>
         </w:rPr>
-        <w:t xml:space="preserve">#&gt;            edf  Ref.df  Chi.sq   p-value</w:t>
+        <w:t xml:space="preserve">#&gt;            edf  Ref.df  Chi.sq    p-value</w:t>
       </w:r>
       <w:r>
         <w:br/>
@@ -43030,7 +43030,7 @@
         <w:rPr>
           <w:rStyle w:val="CommentTok"/>
         </w:rPr>
-        <w:t xml:space="preserve">#&gt; s(age) 1.00107 1.00214 36.4005 0.0000000</w:t>
+        <w:t xml:space="preserve">#&gt; s(age) 1.00156 1.00312 36.3980 0.00000000</w:t>
       </w:r>
       <w:r>
         <w:br/>
@@ -43039,7 +43039,7 @@
         <w:rPr>
           <w:rStyle w:val="CommentTok"/>
         </w:rPr>
-        <w:t xml:space="preserve">#&gt; s(bmi) 1.29959 1.54968 10.8386 0.0064354</w:t>
+        <w:t xml:space="preserve">#&gt; s(bmi) 1.29791 1.54685 10.8353 0.00641275</w:t>
       </w:r>
     </w:p>
     <w:p>
@@ -45369,7 +45369,7 @@
         <w:rPr>
           <w:rStyle w:val="CommentTok"/>
         </w:rPr>
-        <w:t xml:space="preserve">#&gt; s(age)  1.00   1.00  26.55 1.1e-06 ***</w:t>
+        <w:t xml:space="preserve">#&gt; s(age)  1.00   1.00  26.55 5.8e-07 ***</w:t>
       </w:r>
       <w:r>
         <w:br/>
@@ -45396,7 +45396,7 @@
         <w:rPr>
           <w:rStyle w:val="CommentTok"/>
         </w:rPr>
-        <w:t xml:space="preserve">#&gt; s(sbp)  1.00   1.00  22.83 1.4e-06 ***</w:t>
+        <w:t xml:space="preserve">#&gt; s(sbp)  1.00   1.00  22.83 1.7e-06 ***</w:t>
       </w:r>
       <w:r>
         <w:br/>

</xml_diff>

<commit_message>
Deploying to gh-pages from @ Morrison-Lab/rme@bda09d2c6e44082a814b2119e0dcaf1a26ebc04e 🚀
</commit_message>
<xml_diff>
--- a/chapters/generalized-additive-models-handout.docx
+++ b/chapters/generalized-additive-models-handout.docx
@@ -40243,7 +40243,7 @@
         <w:rPr>
           <w:rStyle w:val="CommentTok"/>
         </w:rPr>
-        <w:t xml:space="preserve">#&gt; 1.02 1.03  total = 4.05 </w:t>
+        <w:t xml:space="preserve">#&gt; 1.00 1.01  total = 4.01 </w:t>
       </w:r>
       <w:r>
         <w:br/>
@@ -41982,7 +41982,7 @@
         <w:rPr>
           <w:rStyle w:val="VerbatimChar"/>
         </w:rPr>
-        <w:t xml:space="preserve">#&gt; Gradient range [-0.000404069,-1.352e-05]</w:t>
+        <w:t xml:space="preserve">#&gt; Gradient range [-0.000358419,-2.1343e-05]</w:t>
       </w:r>
       <w:r>
         <w:br/>
@@ -42000,7 +42000,7 @@
         <w:rPr>
           <w:rStyle w:val="VerbatimChar"/>
         </w:rPr>
-        <w:t xml:space="preserve">#&gt; Hessian positive definite, eigenvalue range [1.35192e-05,0.220195].</w:t>
+        <w:t xml:space="preserve">#&gt; Hessian positive definite, eigenvalue range [3.16164e-05,0.220195].</w:t>
       </w:r>
       <w:r>
         <w:br/>
@@ -42947,7 +42947,7 @@
         <w:rPr>
           <w:rStyle w:val="CommentTok"/>
         </w:rPr>
-        <w:t xml:space="preserve">#&gt;               Estimate Std. Error   z value     Pr(&gt;|z|)</w:t>
+        <w:t xml:space="preserve">#&gt;              Estimate Std. Error   z value     Pr(&gt;|z|)</w:t>
       </w:r>
       <w:r>
         <w:br/>
@@ -42956,7 +42956,7 @@
         <w:rPr>
           <w:rStyle w:val="CommentTok"/>
         </w:rPr>
-        <w:t xml:space="preserve">#&gt; (Intercept)  -2.971461   0.117513 -25.28618 4.53331e-141</w:t>
+        <w:t xml:space="preserve">#&gt; (Intercept)  -2.97147   0.117513 -25.28619 4.53227e-141</w:t>
       </w:r>
       <w:r>
         <w:br/>
@@ -42965,7 +42965,7 @@
         <w:rPr>
           <w:rStyle w:val="CommentTok"/>
         </w:rPr>
-        <w:t xml:space="preserve">#&gt; dibpatType A  0.781729   0.141714   5.51626  3.46292e-08</w:t>
+        <w:t xml:space="preserve">#&gt; dibpatType A  0.78173   0.141714   5.51627  3.46277e-08</w:t>
       </w:r>
     </w:p>
     <w:p>
@@ -43021,7 +43021,7 @@
         <w:rPr>
           <w:rStyle w:val="CommentTok"/>
         </w:rPr>
-        <w:t xml:space="preserve">#&gt;            edf  Ref.df  Chi.sq    p-value</w:t>
+        <w:t xml:space="preserve">#&gt;            edf  Ref.df  Chi.sq   p-value</w:t>
       </w:r>
       <w:r>
         <w:br/>
@@ -43030,7 +43030,7 @@
         <w:rPr>
           <w:rStyle w:val="CommentTok"/>
         </w:rPr>
-        <w:t xml:space="preserve">#&gt; s(age) 1.00156 1.00312 36.3980 0.00000000</w:t>
+        <w:t xml:space="preserve">#&gt; s(age) 1.00107 1.00214 36.4005 0.0000000</w:t>
       </w:r>
       <w:r>
         <w:br/>
@@ -43039,7 +43039,7 @@
         <w:rPr>
           <w:rStyle w:val="CommentTok"/>
         </w:rPr>
-        <w:t xml:space="preserve">#&gt; s(bmi) 1.29791 1.54685 10.8353 0.00641275</w:t>
+        <w:t xml:space="preserve">#&gt; s(bmi) 1.29959 1.54968 10.8386 0.0064354</w:t>
       </w:r>
     </w:p>
     <w:p>
@@ -45369,7 +45369,7 @@
         <w:rPr>
           <w:rStyle w:val="CommentTok"/>
         </w:rPr>
-        <w:t xml:space="preserve">#&gt; s(age)  1.00   1.00  26.55 5.8e-07 ***</w:t>
+        <w:t xml:space="preserve">#&gt; s(age)  1.00   1.00  26.55 1.1e-06 ***</w:t>
       </w:r>
       <w:r>
         <w:br/>
@@ -45396,7 +45396,7 @@
         <w:rPr>
           <w:rStyle w:val="CommentTok"/>
         </w:rPr>
-        <w:t xml:space="preserve">#&gt; s(sbp)  1.00   1.00  22.83 1.7e-06 ***</w:t>
+        <w:t xml:space="preserve">#&gt; s(sbp)  1.00   1.00  22.83 1.4e-06 ***</w:t>
       </w:r>
       <w:r>
         <w:br/>

</xml_diff>

<commit_message>
Deploying to gh-pages from @ Morrison-Lab/rme@3081f5c742522778a21c0c787034c083bf074178 🚀
</commit_message>
<xml_diff>
--- a/chapters/generalized-additive-models-handout.docx
+++ b/chapters/generalized-additive-models-handout.docx
@@ -35760,7 +35760,7 @@
         <w:rPr>
           <w:rStyle w:val="CommentTok"/>
         </w:rPr>
-        <w:t xml:space="preserve">#&gt; 1.02 1.03  total = 4.05 </w:t>
+        <w:t xml:space="preserve">#&gt; 1.00 1.01  total = 4.01 </w:t>
       </w:r>
       <w:r>
         <w:br/>
@@ -37499,7 +37499,7 @@
         <w:rPr>
           <w:rStyle w:val="VerbatimChar"/>
         </w:rPr>
-        <w:t xml:space="preserve">#&gt; Gradient range [-0.000404069,-1.352e-05]</w:t>
+        <w:t xml:space="preserve">#&gt; Gradient range [-0.000358419,-2.1343e-05]</w:t>
       </w:r>
       <w:r>
         <w:br/>
@@ -37517,7 +37517,7 @@
         <w:rPr>
           <w:rStyle w:val="VerbatimChar"/>
         </w:rPr>
-        <w:t xml:space="preserve">#&gt; Hessian positive definite, eigenvalue range [1.35192e-05,0.220195].</w:t>
+        <w:t xml:space="preserve">#&gt; Hessian positive definite, eigenvalue range [3.16164e-05,0.220195].</w:t>
       </w:r>
       <w:r>
         <w:br/>
@@ -38464,7 +38464,7 @@
         <w:rPr>
           <w:rStyle w:val="CommentTok"/>
         </w:rPr>
-        <w:t xml:space="preserve">#&gt;               Estimate Std. Error   z value     Pr(&gt;|z|)</w:t>
+        <w:t xml:space="preserve">#&gt;              Estimate Std. Error   z value     Pr(&gt;|z|)</w:t>
       </w:r>
       <w:r>
         <w:br/>
@@ -38473,7 +38473,7 @@
         <w:rPr>
           <w:rStyle w:val="CommentTok"/>
         </w:rPr>
-        <w:t xml:space="preserve">#&gt; (Intercept)  -2.971461   0.117513 -25.28618 4.53331e-141</w:t>
+        <w:t xml:space="preserve">#&gt; (Intercept)  -2.97147   0.117513 -25.28619 4.53227e-141</w:t>
       </w:r>
       <w:r>
         <w:br/>
@@ -38482,7 +38482,7 @@
         <w:rPr>
           <w:rStyle w:val="CommentTok"/>
         </w:rPr>
-        <w:t xml:space="preserve">#&gt; dibpatType A  0.781729   0.141714   5.51626  3.46292e-08</w:t>
+        <w:t xml:space="preserve">#&gt; dibpatType A  0.78173   0.141714   5.51627  3.46277e-08</w:t>
       </w:r>
     </w:p>
     <w:p>
@@ -38538,7 +38538,7 @@
         <w:rPr>
           <w:rStyle w:val="CommentTok"/>
         </w:rPr>
-        <w:t xml:space="preserve">#&gt;            edf  Ref.df  Chi.sq    p-value</w:t>
+        <w:t xml:space="preserve">#&gt;            edf  Ref.df  Chi.sq   p-value</w:t>
       </w:r>
       <w:r>
         <w:br/>
@@ -38547,7 +38547,7 @@
         <w:rPr>
           <w:rStyle w:val="CommentTok"/>
         </w:rPr>
-        <w:t xml:space="preserve">#&gt; s(age) 1.00156 1.00312 36.3980 0.00000000</w:t>
+        <w:t xml:space="preserve">#&gt; s(age) 1.00107 1.00214 36.4005 0.0000000</w:t>
       </w:r>
       <w:r>
         <w:br/>
@@ -38556,7 +38556,7 @@
         <w:rPr>
           <w:rStyle w:val="CommentTok"/>
         </w:rPr>
-        <w:t xml:space="preserve">#&gt; s(bmi) 1.29791 1.54685 10.8353 0.00641275</w:t>
+        <w:t xml:space="preserve">#&gt; s(bmi) 1.29959 1.54968 10.8386 0.0064354</w:t>
       </w:r>
     </w:p>
     <w:p>
@@ -40886,7 +40886,7 @@
         <w:rPr>
           <w:rStyle w:val="CommentTok"/>
         </w:rPr>
-        <w:t xml:space="preserve">#&gt; s(age)  1.00   1.00  26.55 5.8e-07 ***</w:t>
+        <w:t xml:space="preserve">#&gt; s(age)  1.00   1.00  26.55 1.1e-06 ***</w:t>
       </w:r>
       <w:r>
         <w:br/>
@@ -40913,7 +40913,7 @@
         <w:rPr>
           <w:rStyle w:val="CommentTok"/>
         </w:rPr>
-        <w:t xml:space="preserve">#&gt; s(sbp)  1.00   1.00  22.83 1.7e-06 ***</w:t>
+        <w:t xml:space="preserve">#&gt; s(sbp)  1.00   1.00  22.83 1.4e-06 ***</w:t>
       </w:r>
       <w:r>
         <w:br/>

</xml_diff>

<commit_message>
Deploying to gh-pages from @ Morrison-Lab/rme@335a2550c459311ad9d3b42cbed590f9ae6df277 🚀
</commit_message>
<xml_diff>
--- a/chapters/generalized-additive-models-handout.docx
+++ b/chapters/generalized-additive-models-handout.docx
@@ -35607,7 +35607,7 @@
         <w:rPr>
           <w:rStyle w:val="CommentTok"/>
         </w:rPr>
-        <w:t xml:space="preserve">#&gt; 1.02 1.03  total = 4.05 </w:t>
+        <w:t xml:space="preserve">#&gt; 1.00 1.01  total = 4.01 </w:t>
       </w:r>
       <w:r>
         <w:br/>
@@ -37346,7 +37346,7 @@
         <w:rPr>
           <w:rStyle w:val="VerbatimChar"/>
         </w:rPr>
-        <w:t xml:space="preserve">#&gt; Gradient range [-0.000404069,-1.352e-05]</w:t>
+        <w:t xml:space="preserve">#&gt; Gradient range [-0.000358419,-2.1343e-05]</w:t>
       </w:r>
       <w:r>
         <w:br/>
@@ -37364,7 +37364,7 @@
         <w:rPr>
           <w:rStyle w:val="VerbatimChar"/>
         </w:rPr>
-        <w:t xml:space="preserve">#&gt; Hessian positive definite, eigenvalue range [1.35192e-05,0.220195].</w:t>
+        <w:t xml:space="preserve">#&gt; Hessian positive definite, eigenvalue range [3.16164e-05,0.220195].</w:t>
       </w:r>
       <w:r>
         <w:br/>
@@ -38311,7 +38311,7 @@
         <w:rPr>
           <w:rStyle w:val="CommentTok"/>
         </w:rPr>
-        <w:t xml:space="preserve">#&gt;               Estimate Std. Error   z value     Pr(&gt;|z|)</w:t>
+        <w:t xml:space="preserve">#&gt;              Estimate Std. Error   z value     Pr(&gt;|z|)</w:t>
       </w:r>
       <w:r>
         <w:br/>
@@ -38320,7 +38320,7 @@
         <w:rPr>
           <w:rStyle w:val="CommentTok"/>
         </w:rPr>
-        <w:t xml:space="preserve">#&gt; (Intercept)  -2.971461   0.117513 -25.28618 4.53331e-141</w:t>
+        <w:t xml:space="preserve">#&gt; (Intercept)  -2.97147   0.117513 -25.28619 4.53227e-141</w:t>
       </w:r>
       <w:r>
         <w:br/>
@@ -38329,7 +38329,7 @@
         <w:rPr>
           <w:rStyle w:val="CommentTok"/>
         </w:rPr>
-        <w:t xml:space="preserve">#&gt; dibpatType A  0.781729   0.141714   5.51626  3.46292e-08</w:t>
+        <w:t xml:space="preserve">#&gt; dibpatType A  0.78173   0.141714   5.51627  3.46277e-08</w:t>
       </w:r>
     </w:p>
     <w:p>
@@ -38385,7 +38385,7 @@
         <w:rPr>
           <w:rStyle w:val="CommentTok"/>
         </w:rPr>
-        <w:t xml:space="preserve">#&gt;            edf  Ref.df  Chi.sq    p-value</w:t>
+        <w:t xml:space="preserve">#&gt;            edf  Ref.df  Chi.sq   p-value</w:t>
       </w:r>
       <w:r>
         <w:br/>
@@ -38394,7 +38394,7 @@
         <w:rPr>
           <w:rStyle w:val="CommentTok"/>
         </w:rPr>
-        <w:t xml:space="preserve">#&gt; s(age) 1.00156 1.00312 36.3980 0.00000000</w:t>
+        <w:t xml:space="preserve">#&gt; s(age) 1.00107 1.00214 36.4005 0.0000000</w:t>
       </w:r>
       <w:r>
         <w:br/>
@@ -38403,7 +38403,7 @@
         <w:rPr>
           <w:rStyle w:val="CommentTok"/>
         </w:rPr>
-        <w:t xml:space="preserve">#&gt; s(bmi) 1.29791 1.54685 10.8353 0.00641275</w:t>
+        <w:t xml:space="preserve">#&gt; s(bmi) 1.29959 1.54968 10.8386 0.0064354</w:t>
       </w:r>
     </w:p>
     <w:p>
@@ -40733,7 +40733,7 @@
         <w:rPr>
           <w:rStyle w:val="CommentTok"/>
         </w:rPr>
-        <w:t xml:space="preserve">#&gt; s(age)  1.00   1.00  26.55 5.8e-07 ***</w:t>
+        <w:t xml:space="preserve">#&gt; s(age)  1.00   1.00  26.55 1.1e-06 ***</w:t>
       </w:r>
       <w:r>
         <w:br/>
@@ -40760,7 +40760,7 @@
         <w:rPr>
           <w:rStyle w:val="CommentTok"/>
         </w:rPr>
-        <w:t xml:space="preserve">#&gt; s(sbp)  1.00   1.00  22.83 1.7e-06 ***</w:t>
+        <w:t xml:space="preserve">#&gt; s(sbp)  1.00   1.00  22.83 1.4e-06 ***</w:t>
       </w:r>
       <w:r>
         <w:br/>

</xml_diff>

<commit_message>
Deploying to gh-pages from @ Morrison-Lab/rme@86e7f76e1978310ee01199a80c29e0dd2b2f2c5b 🚀
</commit_message>
<xml_diff>
--- a/chapters/generalized-additive-models-handout.docx
+++ b/chapters/generalized-additive-models-handout.docx
@@ -35607,7 +35607,7 @@
         <w:rPr>
           <w:rStyle w:val="CommentTok"/>
         </w:rPr>
-        <w:t xml:space="preserve">#&gt; 1.00 1.01  total = 4.01 </w:t>
+        <w:t xml:space="preserve">#&gt; 1.02 1.03  total = 4.05 </w:t>
       </w:r>
       <w:r>
         <w:br/>
@@ -37346,7 +37346,7 @@
         <w:rPr>
           <w:rStyle w:val="VerbatimChar"/>
         </w:rPr>
-        <w:t xml:space="preserve">#&gt; Gradient range [-0.000358419,-2.1343e-05]</w:t>
+        <w:t xml:space="preserve">#&gt; Gradient range [-0.000404069,-1.352e-05]</w:t>
       </w:r>
       <w:r>
         <w:br/>
@@ -37364,7 +37364,7 @@
         <w:rPr>
           <w:rStyle w:val="VerbatimChar"/>
         </w:rPr>
-        <w:t xml:space="preserve">#&gt; Hessian positive definite, eigenvalue range [3.16164e-05,0.220195].</w:t>
+        <w:t xml:space="preserve">#&gt; Hessian positive definite, eigenvalue range [1.35192e-05,0.220195].</w:t>
       </w:r>
       <w:r>
         <w:br/>
@@ -38311,7 +38311,7 @@
         <w:rPr>
           <w:rStyle w:val="CommentTok"/>
         </w:rPr>
-        <w:t xml:space="preserve">#&gt;              Estimate Std. Error   z value     Pr(&gt;|z|)</w:t>
+        <w:t xml:space="preserve">#&gt;               Estimate Std. Error   z value     Pr(&gt;|z|)</w:t>
       </w:r>
       <w:r>
         <w:br/>
@@ -38320,7 +38320,7 @@
         <w:rPr>
           <w:rStyle w:val="CommentTok"/>
         </w:rPr>
-        <w:t xml:space="preserve">#&gt; (Intercept)  -2.97147   0.117513 -25.28619 4.53227e-141</w:t>
+        <w:t xml:space="preserve">#&gt; (Intercept)  -2.971461   0.117513 -25.28618 4.53331e-141</w:t>
       </w:r>
       <w:r>
         <w:br/>
@@ -38329,7 +38329,7 @@
         <w:rPr>
           <w:rStyle w:val="CommentTok"/>
         </w:rPr>
-        <w:t xml:space="preserve">#&gt; dibpatType A  0.78173   0.141714   5.51627  3.46277e-08</w:t>
+        <w:t xml:space="preserve">#&gt; dibpatType A  0.781729   0.141714   5.51626  3.46292e-08</w:t>
       </w:r>
     </w:p>
     <w:p>
@@ -38385,7 +38385,7 @@
         <w:rPr>
           <w:rStyle w:val="CommentTok"/>
         </w:rPr>
-        <w:t xml:space="preserve">#&gt;            edf  Ref.df  Chi.sq   p-value</w:t>
+        <w:t xml:space="preserve">#&gt;            edf  Ref.df  Chi.sq    p-value</w:t>
       </w:r>
       <w:r>
         <w:br/>
@@ -38394,7 +38394,7 @@
         <w:rPr>
           <w:rStyle w:val="CommentTok"/>
         </w:rPr>
-        <w:t xml:space="preserve">#&gt; s(age) 1.00107 1.00214 36.4005 0.0000000</w:t>
+        <w:t xml:space="preserve">#&gt; s(age) 1.00156 1.00312 36.3980 0.00000000</w:t>
       </w:r>
       <w:r>
         <w:br/>
@@ -38403,7 +38403,7 @@
         <w:rPr>
           <w:rStyle w:val="CommentTok"/>
         </w:rPr>
-        <w:t xml:space="preserve">#&gt; s(bmi) 1.29959 1.54968 10.8386 0.0064354</w:t>
+        <w:t xml:space="preserve">#&gt; s(bmi) 1.29791 1.54685 10.8353 0.00641275</w:t>
       </w:r>
     </w:p>
     <w:p>
@@ -40733,7 +40733,7 @@
         <w:rPr>
           <w:rStyle w:val="CommentTok"/>
         </w:rPr>
-        <w:t xml:space="preserve">#&gt; s(age)  1.00   1.00  26.55 1.1e-06 ***</w:t>
+        <w:t xml:space="preserve">#&gt; s(age)  1.00   1.00  26.55 5.8e-07 ***</w:t>
       </w:r>
       <w:r>
         <w:br/>
@@ -40760,7 +40760,7 @@
         <w:rPr>
           <w:rStyle w:val="CommentTok"/>
         </w:rPr>
-        <w:t xml:space="preserve">#&gt; s(sbp)  1.00   1.00  22.83 1.4e-06 ***</w:t>
+        <w:t xml:space="preserve">#&gt; s(sbp)  1.00   1.00  22.83 1.7e-06 ***</w:t>
       </w:r>
       <w:r>
         <w:br/>

</xml_diff>

<commit_message>
Deploying to gh-pages from @ Morrison-Lab/rme@971c4a3a9a4b91b3d5e4562a981954ef2934a4d3 🚀
</commit_message>
<xml_diff>
--- a/chapters/generalized-additive-models-handout.docx
+++ b/chapters/generalized-additive-models-handout.docx
@@ -35613,7 +35613,7 @@
         <w:rPr>
           <w:rStyle w:val="CommentTok"/>
         </w:rPr>
-        <w:t xml:space="preserve">#&gt; 1.00 1.01  total = 4.01 </w:t>
+        <w:t xml:space="preserve">#&gt; 1.02 1.03  total = 4.05 </w:t>
       </w:r>
       <w:r>
         <w:br/>
@@ -37352,7 +37352,7 @@
         <w:rPr>
           <w:rStyle w:val="VerbatimChar"/>
         </w:rPr>
-        <w:t xml:space="preserve">#&gt; Gradient range [-0.000358419,-2.1343e-05]</w:t>
+        <w:t xml:space="preserve">#&gt; Gradient range [-0.000404069,-1.352e-05]</w:t>
       </w:r>
       <w:r>
         <w:br/>
@@ -37370,7 +37370,7 @@
         <w:rPr>
           <w:rStyle w:val="VerbatimChar"/>
         </w:rPr>
-        <w:t xml:space="preserve">#&gt; Hessian positive definite, eigenvalue range [3.16164e-05,0.220195].</w:t>
+        <w:t xml:space="preserve">#&gt; Hessian positive definite, eigenvalue range [1.35192e-05,0.220195].</w:t>
       </w:r>
       <w:r>
         <w:br/>
@@ -38318,7 +38318,7 @@
         <w:rPr>
           <w:rStyle w:val="CommentTok"/>
         </w:rPr>
-        <w:t xml:space="preserve">#&gt;              Estimate Std. Error   z value     Pr(&gt;|z|)</w:t>
+        <w:t xml:space="preserve">#&gt;               Estimate Std. Error   z value     Pr(&gt;|z|)</w:t>
       </w:r>
       <w:r>
         <w:br/>
@@ -38327,7 +38327,7 @@
         <w:rPr>
           <w:rStyle w:val="CommentTok"/>
         </w:rPr>
-        <w:t xml:space="preserve">#&gt; (Intercept)  -2.97147   0.117513 -25.28619 4.53227e-141</w:t>
+        <w:t xml:space="preserve">#&gt; (Intercept)  -2.971461   0.117513 -25.28618 4.53331e-141</w:t>
       </w:r>
       <w:r>
         <w:br/>
@@ -38336,7 +38336,7 @@
         <w:rPr>
           <w:rStyle w:val="CommentTok"/>
         </w:rPr>
-        <w:t xml:space="preserve">#&gt; dibpatType A  0.78173   0.141714   5.51627  3.46277e-08</w:t>
+        <w:t xml:space="preserve">#&gt; dibpatType A  0.781729   0.141714   5.51626  3.46292e-08</w:t>
       </w:r>
     </w:p>
     <w:p>
@@ -38392,7 +38392,7 @@
         <w:rPr>
           <w:rStyle w:val="CommentTok"/>
         </w:rPr>
-        <w:t xml:space="preserve">#&gt;            edf  Ref.df  Chi.sq   p-value</w:t>
+        <w:t xml:space="preserve">#&gt;            edf  Ref.df  Chi.sq    p-value</w:t>
       </w:r>
       <w:r>
         <w:br/>
@@ -38401,7 +38401,7 @@
         <w:rPr>
           <w:rStyle w:val="CommentTok"/>
         </w:rPr>
-        <w:t xml:space="preserve">#&gt; s(age) 1.00107 1.00214 36.4005 0.0000000</w:t>
+        <w:t xml:space="preserve">#&gt; s(age) 1.00156 1.00312 36.3980 0.00000000</w:t>
       </w:r>
       <w:r>
         <w:br/>
@@ -38410,7 +38410,7 @@
         <w:rPr>
           <w:rStyle w:val="CommentTok"/>
         </w:rPr>
-        <w:t xml:space="preserve">#&gt; s(bmi) 1.29959 1.54968 10.8386 0.0064354</w:t>
+        <w:t xml:space="preserve">#&gt; s(bmi) 1.29791 1.54685 10.8353 0.00641275</w:t>
       </w:r>
     </w:p>
     <w:p>
@@ -40740,7 +40740,7 @@
         <w:rPr>
           <w:rStyle w:val="CommentTok"/>
         </w:rPr>
-        <w:t xml:space="preserve">#&gt; s(age)  1.00   1.00  26.55 1.1e-06 ***</w:t>
+        <w:t xml:space="preserve">#&gt; s(age)  1.00   1.00  26.55 5.8e-07 ***</w:t>
       </w:r>
       <w:r>
         <w:br/>
@@ -40767,7 +40767,7 @@
         <w:rPr>
           <w:rStyle w:val="CommentTok"/>
         </w:rPr>
-        <w:t xml:space="preserve">#&gt; s(sbp)  1.00   1.00  22.83 1.4e-06 ***</w:t>
+        <w:t xml:space="preserve">#&gt; s(sbp)  1.00   1.00  22.83 1.7e-06 ***</w:t>
       </w:r>
       <w:r>
         <w:br/>

</xml_diff>

<commit_message>
Deploying to gh-pages from @ Morrison-Lab/rme@0baa5b5673d9fab69460e7b687a45c0118e8c674 🚀
</commit_message>
<xml_diff>
--- a/chapters/generalized-additive-models-handout.docx
+++ b/chapters/generalized-additive-models-handout.docx
@@ -30248,7 +30248,7 @@
                           <w:rPr>
                             <w:rStyle w:val="StringTok"/>
                           </w:rPr>
-                          <w:t xml:space="preserve">"x"</w:t>
+                          <w:t xml:space="preserve">"Predictor, x"</w:t>
                         </w:r>
                         <w:r>
                           <w:rPr>
@@ -30272,7 +30272,7 @@
                           <w:rPr>
                             <w:rStyle w:val="StringTok"/>
                           </w:rPr>
-                          <w:t xml:space="preserve">"y"</w:t>
+                          <w:t xml:space="preserve">"Response, y"</w:t>
                         </w:r>
                         <w:r>
                           <w:rPr>
@@ -31056,7 +31056,7 @@
                           <w:rPr>
                             <w:rStyle w:val="StringTok"/>
                           </w:rPr>
-                          <w:t xml:space="preserve">"x"</w:t>
+                          <w:t xml:space="preserve">"Predictor, x"</w:t>
                         </w:r>
                         <w:r>
                           <w:rPr>
@@ -31080,7 +31080,7 @@
                           <w:rPr>
                             <w:rStyle w:val="StringTok"/>
                           </w:rPr>
-                          <w:t xml:space="preserve">"y"</w:t>
+                          <w:t xml:space="preserve">"Response, y"</w:t>
                         </w:r>
                         <w:r>
                           <w:rPr>
@@ -32056,7 +32056,7 @@
                           <w:rPr>
                             <w:rStyle w:val="StringTok"/>
                           </w:rPr>
-                          <w:t xml:space="preserve">"x"</w:t>
+                          <w:t xml:space="preserve">"Predictor, x"</w:t>
                         </w:r>
                         <w:r>
                           <w:rPr>
@@ -32080,7 +32080,7 @@
                           <w:rPr>
                             <w:rStyle w:val="StringTok"/>
                           </w:rPr>
-                          <w:t xml:space="preserve">"y"</w:t>
+                          <w:t xml:space="preserve">"Response, y"</w:t>
                         </w:r>
                         <w:r>
                           <w:rPr>
@@ -32874,7 +32874,7 @@
                           <w:rPr>
                             <w:rStyle w:val="StringTok"/>
                           </w:rPr>
-                          <w:t xml:space="preserve">"x"</w:t>
+                          <w:t xml:space="preserve">"Predictor, x"</w:t>
                         </w:r>
                         <w:r>
                           <w:rPr>
@@ -32898,7 +32898,7 @@
                           <w:rPr>
                             <w:rStyle w:val="StringTok"/>
                           </w:rPr>
-                          <w:t xml:space="preserve">"y"</w:t>
+                          <w:t xml:space="preserve">"Response, y"</w:t>
                         </w:r>
                         <w:r>
                           <w:rPr>
@@ -35613,7 +35613,7 @@
         <w:rPr>
           <w:rStyle w:val="CommentTok"/>
         </w:rPr>
-        <w:t xml:space="preserve">#&gt; 1.02 1.03  total = 4.05 </w:t>
+        <w:t xml:space="preserve">#&gt; 1.00 1.01  total = 4.01 </w:t>
       </w:r>
       <w:r>
         <w:br/>
@@ -37352,7 +37352,7 @@
         <w:rPr>
           <w:rStyle w:val="VerbatimChar"/>
         </w:rPr>
-        <w:t xml:space="preserve">#&gt; Gradient range [-0.000404069,-1.352e-05]</w:t>
+        <w:t xml:space="preserve">#&gt; Gradient range [-0.000358419,-2.1343e-05]</w:t>
       </w:r>
       <w:r>
         <w:br/>
@@ -37370,7 +37370,7 @@
         <w:rPr>
           <w:rStyle w:val="VerbatimChar"/>
         </w:rPr>
-        <w:t xml:space="preserve">#&gt; Hessian positive definite, eigenvalue range [1.35192e-05,0.220195].</w:t>
+        <w:t xml:space="preserve">#&gt; Hessian positive definite, eigenvalue range [3.16164e-05,0.220195].</w:t>
       </w:r>
       <w:r>
         <w:br/>
@@ -38318,7 +38318,7 @@
         <w:rPr>
           <w:rStyle w:val="CommentTok"/>
         </w:rPr>
-        <w:t xml:space="preserve">#&gt;               Estimate Std. Error   z value     Pr(&gt;|z|)</w:t>
+        <w:t xml:space="preserve">#&gt;              Estimate Std. Error   z value     Pr(&gt;|z|)</w:t>
       </w:r>
       <w:r>
         <w:br/>
@@ -38327,7 +38327,7 @@
         <w:rPr>
           <w:rStyle w:val="CommentTok"/>
         </w:rPr>
-        <w:t xml:space="preserve">#&gt; (Intercept)  -2.971461   0.117513 -25.28618 4.53331e-141</w:t>
+        <w:t xml:space="preserve">#&gt; (Intercept)  -2.97147   0.117513 -25.28619 4.53227e-141</w:t>
       </w:r>
       <w:r>
         <w:br/>
@@ -38336,7 +38336,7 @@
         <w:rPr>
           <w:rStyle w:val="CommentTok"/>
         </w:rPr>
-        <w:t xml:space="preserve">#&gt; dibpatType A  0.781729   0.141714   5.51626  3.46292e-08</w:t>
+        <w:t xml:space="preserve">#&gt; dibpatType A  0.78173   0.141714   5.51627  3.46277e-08</w:t>
       </w:r>
     </w:p>
     <w:p>
@@ -38392,7 +38392,7 @@
         <w:rPr>
           <w:rStyle w:val="CommentTok"/>
         </w:rPr>
-        <w:t xml:space="preserve">#&gt;            edf  Ref.df  Chi.sq    p-value</w:t>
+        <w:t xml:space="preserve">#&gt;            edf  Ref.df  Chi.sq   p-value</w:t>
       </w:r>
       <w:r>
         <w:br/>
@@ -38401,7 +38401,7 @@
         <w:rPr>
           <w:rStyle w:val="CommentTok"/>
         </w:rPr>
-        <w:t xml:space="preserve">#&gt; s(age) 1.00156 1.00312 36.3980 0.00000000</w:t>
+        <w:t xml:space="preserve">#&gt; s(age) 1.00107 1.00214 36.4005 0.0000000</w:t>
       </w:r>
       <w:r>
         <w:br/>
@@ -38410,7 +38410,7 @@
         <w:rPr>
           <w:rStyle w:val="CommentTok"/>
         </w:rPr>
-        <w:t xml:space="preserve">#&gt; s(bmi) 1.29791 1.54685 10.8353 0.00641275</w:t>
+        <w:t xml:space="preserve">#&gt; s(bmi) 1.29959 1.54968 10.8386 0.0064354</w:t>
       </w:r>
     </w:p>
     <w:p>
@@ -40740,7 +40740,7 @@
         <w:rPr>
           <w:rStyle w:val="CommentTok"/>
         </w:rPr>
-        <w:t xml:space="preserve">#&gt; s(age)  1.00   1.00  26.55 5.8e-07 ***</w:t>
+        <w:t xml:space="preserve">#&gt; s(age)  1.00   1.00  26.55 1.1e-06 ***</w:t>
       </w:r>
       <w:r>
         <w:br/>
@@ -40767,7 +40767,7 @@
         <w:rPr>
           <w:rStyle w:val="CommentTok"/>
         </w:rPr>
-        <w:t xml:space="preserve">#&gt; s(sbp)  1.00   1.00  22.83 1.7e-06 ***</w:t>
+        <w:t xml:space="preserve">#&gt; s(sbp)  1.00   1.00  22.83 1.4e-06 ***</w:t>
       </w:r>
       <w:r>
         <w:br/>

</xml_diff>

<commit_message>
Deploying to gh-pages from @ Morrison-Lab/rme@19b747f5b9cc2d4c10c7469f43ad79baf1c5c45b 🚀
</commit_message>
<xml_diff>
--- a/chapters/generalized-additive-models-handout.docx
+++ b/chapters/generalized-additive-models-handout.docx
@@ -35613,7 +35613,7 @@
         <w:rPr>
           <w:rStyle w:val="CommentTok"/>
         </w:rPr>
-        <w:t xml:space="preserve">#&gt; 1.00 1.01  total = 4.01 </w:t>
+        <w:t xml:space="preserve">#&gt; 1.02 1.03  total = 4.05 </w:t>
       </w:r>
       <w:r>
         <w:br/>
@@ -37352,7 +37352,7 @@
         <w:rPr>
           <w:rStyle w:val="VerbatimChar"/>
         </w:rPr>
-        <w:t xml:space="preserve">#&gt; Gradient range [-0.000358419,-2.1343e-05]</w:t>
+        <w:t xml:space="preserve">#&gt; Gradient range [-0.000404069,-1.352e-05]</w:t>
       </w:r>
       <w:r>
         <w:br/>
@@ -37370,7 +37370,7 @@
         <w:rPr>
           <w:rStyle w:val="VerbatimChar"/>
         </w:rPr>
-        <w:t xml:space="preserve">#&gt; Hessian positive definite, eigenvalue range [3.16164e-05,0.220195].</w:t>
+        <w:t xml:space="preserve">#&gt; Hessian positive definite, eigenvalue range [1.35192e-05,0.220195].</w:t>
       </w:r>
       <w:r>
         <w:br/>
@@ -38318,7 +38318,7 @@
         <w:rPr>
           <w:rStyle w:val="CommentTok"/>
         </w:rPr>
-        <w:t xml:space="preserve">#&gt;              Estimate Std. Error   z value     Pr(&gt;|z|)</w:t>
+        <w:t xml:space="preserve">#&gt;               Estimate Std. Error   z value     Pr(&gt;|z|)</w:t>
       </w:r>
       <w:r>
         <w:br/>
@@ -38327,7 +38327,7 @@
         <w:rPr>
           <w:rStyle w:val="CommentTok"/>
         </w:rPr>
-        <w:t xml:space="preserve">#&gt; (Intercept)  -2.97147   0.117513 -25.28619 4.53227e-141</w:t>
+        <w:t xml:space="preserve">#&gt; (Intercept)  -2.971461   0.117513 -25.28618 4.53331e-141</w:t>
       </w:r>
       <w:r>
         <w:br/>
@@ -38336,7 +38336,7 @@
         <w:rPr>
           <w:rStyle w:val="CommentTok"/>
         </w:rPr>
-        <w:t xml:space="preserve">#&gt; dibpatType A  0.78173   0.141714   5.51627  3.46277e-08</w:t>
+        <w:t xml:space="preserve">#&gt; dibpatType A  0.781729   0.141714   5.51626  3.46292e-08</w:t>
       </w:r>
     </w:p>
     <w:p>
@@ -38392,7 +38392,7 @@
         <w:rPr>
           <w:rStyle w:val="CommentTok"/>
         </w:rPr>
-        <w:t xml:space="preserve">#&gt;            edf  Ref.df  Chi.sq   p-value</w:t>
+        <w:t xml:space="preserve">#&gt;            edf  Ref.df  Chi.sq    p-value</w:t>
       </w:r>
       <w:r>
         <w:br/>
@@ -38401,7 +38401,7 @@
         <w:rPr>
           <w:rStyle w:val="CommentTok"/>
         </w:rPr>
-        <w:t xml:space="preserve">#&gt; s(age) 1.00107 1.00214 36.4005 0.0000000</w:t>
+        <w:t xml:space="preserve">#&gt; s(age) 1.00156 1.00312 36.3980 0.00000000</w:t>
       </w:r>
       <w:r>
         <w:br/>
@@ -38410,7 +38410,7 @@
         <w:rPr>
           <w:rStyle w:val="CommentTok"/>
         </w:rPr>
-        <w:t xml:space="preserve">#&gt; s(bmi) 1.29959 1.54968 10.8386 0.0064354</w:t>
+        <w:t xml:space="preserve">#&gt; s(bmi) 1.29791 1.54685 10.8353 0.00641275</w:t>
       </w:r>
     </w:p>
     <w:p>
@@ -40740,7 +40740,7 @@
         <w:rPr>
           <w:rStyle w:val="CommentTok"/>
         </w:rPr>
-        <w:t xml:space="preserve">#&gt; s(age)  1.00   1.00  26.55 1.1e-06 ***</w:t>
+        <w:t xml:space="preserve">#&gt; s(age)  1.00   1.00  26.55 5.8e-07 ***</w:t>
       </w:r>
       <w:r>
         <w:br/>
@@ -40767,7 +40767,7 @@
         <w:rPr>
           <w:rStyle w:val="CommentTok"/>
         </w:rPr>
-        <w:t xml:space="preserve">#&gt; s(sbp)  1.00   1.00  22.83 1.4e-06 ***</w:t>
+        <w:t xml:space="preserve">#&gt; s(sbp)  1.00   1.00  22.83 1.7e-06 ***</w:t>
       </w:r>
       <w:r>
         <w:br/>

</xml_diff>